<commit_message>
Actualizacion del documento final
</commit_message>
<xml_diff>
--- a/TALLER.docx
+++ b/TALLER.docx
@@ -627,7 +627,7 @@
                     <pic:cNvPicPr/>
                   </pic:nvPicPr>
                   <pic:blipFill rotWithShape="1">
-                    <a:blip r:embed="rId4"/>
+                    <a:blip r:embed="rId5"/>
                     <a:srcRect b="35374"/>
                     <a:stretch/>
                   </pic:blipFill>
@@ -699,7 +699,7 @@
                     <pic:cNvPicPr/>
                   </pic:nvPicPr>
                   <pic:blipFill rotWithShape="1">
-                    <a:blip r:embed="rId4"/>
+                    <a:blip r:embed="rId5"/>
                     <a:srcRect t="61225"/>
                     <a:stretch/>
                   </pic:blipFill>
@@ -745,7 +745,7 @@
                     <pic:cNvPicPr/>
                   </pic:nvPicPr>
                   <pic:blipFill>
-                    <a:blip r:embed="rId5"/>
+                    <a:blip r:embed="rId6"/>
                     <a:stretch>
                       <a:fillRect/>
                     </a:stretch>
@@ -802,49 +802,6 @@
             <wp:extent cx="2934109" cy="1448002"/>
             <wp:effectExtent l="0" t="0" r="0" b="0"/>
             <wp:docPr id="5" name="Imagen 5"/>
-            <wp:cNvGraphicFramePr>
-              <a:graphicFrameLocks xmlns:a="http://schemas.openxmlformats.org/drawingml/2006/main" noChangeAspect="1"/>
-            </wp:cNvGraphicFramePr>
-            <a:graphic xmlns:a="http://schemas.openxmlformats.org/drawingml/2006/main">
-              <a:graphicData uri="http://schemas.openxmlformats.org/drawingml/2006/picture">
-                <pic:pic xmlns:pic="http://schemas.openxmlformats.org/drawingml/2006/picture">
-                  <pic:nvPicPr>
-                    <pic:cNvPr id="1" name=""/>
-                    <pic:cNvPicPr/>
-                  </pic:nvPicPr>
-                  <pic:blipFill>
-                    <a:blip r:embed="rId6"/>
-                    <a:stretch>
-                      <a:fillRect/>
-                    </a:stretch>
-                  </pic:blipFill>
-                  <pic:spPr>
-                    <a:xfrm>
-                      <a:off x="0" y="0"/>
-                      <a:ext cx="2934109" cy="1448002"/>
-                    </a:xfrm>
-                    <a:prstGeom prst="rect">
-                      <a:avLst/>
-                    </a:prstGeom>
-                  </pic:spPr>
-                </pic:pic>
-              </a:graphicData>
-            </a:graphic>
-          </wp:inline>
-        </w:drawing>
-      </w:r>
-    </w:p>
-    <w:p/>
-    <w:p>
-      <w:r>
-        <w:t xml:space="preserve"> </w:t>
-      </w:r>
-      <w:r>
-        <w:drawing>
-          <wp:inline distT="0" distB="0" distL="0" distR="0" wp14:anchorId="313EA6DF" wp14:editId="4B9477A7">
-            <wp:extent cx="2962688" cy="809738"/>
-            <wp:effectExtent l="0" t="0" r="9525" b="9525"/>
-            <wp:docPr id="4" name="Imagen 4"/>
             <wp:cNvGraphicFramePr>
               <a:graphicFrameLocks xmlns:a="http://schemas.openxmlformats.org/drawingml/2006/main" noChangeAspect="1"/>
             </wp:cNvGraphicFramePr>
@@ -864,6 +821,49 @@
                   <pic:spPr>
                     <a:xfrm>
                       <a:off x="0" y="0"/>
+                      <a:ext cx="2934109" cy="1448002"/>
+                    </a:xfrm>
+                    <a:prstGeom prst="rect">
+                      <a:avLst/>
+                    </a:prstGeom>
+                  </pic:spPr>
+                </pic:pic>
+              </a:graphicData>
+            </a:graphic>
+          </wp:inline>
+        </w:drawing>
+      </w:r>
+    </w:p>
+    <w:p/>
+    <w:p>
+      <w:r>
+        <w:t xml:space="preserve"> </w:t>
+      </w:r>
+      <w:r>
+        <w:drawing>
+          <wp:inline distT="0" distB="0" distL="0" distR="0" wp14:anchorId="313EA6DF" wp14:editId="4B9477A7">
+            <wp:extent cx="2962688" cy="809738"/>
+            <wp:effectExtent l="0" t="0" r="9525" b="9525"/>
+            <wp:docPr id="4" name="Imagen 4"/>
+            <wp:cNvGraphicFramePr>
+              <a:graphicFrameLocks xmlns:a="http://schemas.openxmlformats.org/drawingml/2006/main" noChangeAspect="1"/>
+            </wp:cNvGraphicFramePr>
+            <a:graphic xmlns:a="http://schemas.openxmlformats.org/drawingml/2006/main">
+              <a:graphicData uri="http://schemas.openxmlformats.org/drawingml/2006/picture">
+                <pic:pic xmlns:pic="http://schemas.openxmlformats.org/drawingml/2006/picture">
+                  <pic:nvPicPr>
+                    <pic:cNvPr id="1" name=""/>
+                    <pic:cNvPicPr/>
+                  </pic:nvPicPr>
+                  <pic:blipFill>
+                    <a:blip r:embed="rId8"/>
+                    <a:stretch>
+                      <a:fillRect/>
+                    </a:stretch>
+                  </pic:blipFill>
+                  <pic:spPr>
+                    <a:xfrm>
+                      <a:off x="0" y="0"/>
                       <a:ext cx="2962688" cy="809738"/>
                     </a:xfrm>
                     <a:prstGeom prst="rect">
@@ -894,7 +894,874 @@
       </w:r>
     </w:p>
     <w:p/>
-    <w:p/>
+    <w:p>
+      <w:r>
+        <w:drawing>
+          <wp:inline distT="0" distB="0" distL="0" distR="0" wp14:anchorId="4A1D4888" wp14:editId="60745BE7">
+            <wp:extent cx="3543795" cy="590632"/>
+            <wp:effectExtent l="0" t="0" r="0" b="0"/>
+            <wp:docPr id="6" name="Imagen 6"/>
+            <wp:cNvGraphicFramePr>
+              <a:graphicFrameLocks xmlns:a="http://schemas.openxmlformats.org/drawingml/2006/main" noChangeAspect="1"/>
+            </wp:cNvGraphicFramePr>
+            <a:graphic xmlns:a="http://schemas.openxmlformats.org/drawingml/2006/main">
+              <a:graphicData uri="http://schemas.openxmlformats.org/drawingml/2006/picture">
+                <pic:pic xmlns:pic="http://schemas.openxmlformats.org/drawingml/2006/picture">
+                  <pic:nvPicPr>
+                    <pic:cNvPr id="1" name=""/>
+                    <pic:cNvPicPr/>
+                  </pic:nvPicPr>
+                  <pic:blipFill>
+                    <a:blip r:embed="rId9"/>
+                    <a:stretch>
+                      <a:fillRect/>
+                    </a:stretch>
+                  </pic:blipFill>
+                  <pic:spPr>
+                    <a:xfrm>
+                      <a:off x="0" y="0"/>
+                      <a:ext cx="3543795" cy="590632"/>
+                    </a:xfrm>
+                    <a:prstGeom prst="rect">
+                      <a:avLst/>
+                    </a:prstGeom>
+                  </pic:spPr>
+                </pic:pic>
+              </a:graphicData>
+            </a:graphic>
+          </wp:inline>
+        </w:drawing>
+      </w:r>
+    </w:p>
+    <w:p>
+      <w:r>
+        <w:drawing>
+          <wp:inline distT="0" distB="0" distL="0" distR="0" wp14:anchorId="2674DE47" wp14:editId="51CF539A">
+            <wp:extent cx="2790825" cy="1567006"/>
+            <wp:effectExtent l="0" t="0" r="0" b="0"/>
+            <wp:docPr id="7" name="Imagen 7"/>
+            <wp:cNvGraphicFramePr>
+              <a:graphicFrameLocks xmlns:a="http://schemas.openxmlformats.org/drawingml/2006/main" noChangeAspect="1"/>
+            </wp:cNvGraphicFramePr>
+            <a:graphic xmlns:a="http://schemas.openxmlformats.org/drawingml/2006/main">
+              <a:graphicData uri="http://schemas.openxmlformats.org/drawingml/2006/picture">
+                <pic:pic xmlns:pic="http://schemas.openxmlformats.org/drawingml/2006/picture">
+                  <pic:nvPicPr>
+                    <pic:cNvPr id="1" name=""/>
+                    <pic:cNvPicPr/>
+                  </pic:nvPicPr>
+                  <pic:blipFill>
+                    <a:blip r:embed="rId10"/>
+                    <a:stretch>
+                      <a:fillRect/>
+                    </a:stretch>
+                  </pic:blipFill>
+                  <pic:spPr>
+                    <a:xfrm>
+                      <a:off x="0" y="0"/>
+                      <a:ext cx="2793707" cy="1568624"/>
+                    </a:xfrm>
+                    <a:prstGeom prst="rect">
+                      <a:avLst/>
+                    </a:prstGeom>
+                  </pic:spPr>
+                </pic:pic>
+              </a:graphicData>
+            </a:graphic>
+          </wp:inline>
+        </w:drawing>
+      </w:r>
+      <w:r>
+        <w:drawing>
+          <wp:inline distT="0" distB="0" distL="0" distR="0" wp14:anchorId="21016ADA" wp14:editId="663136CF">
+            <wp:extent cx="2552700" cy="2038350"/>
+            <wp:effectExtent l="0" t="0" r="0" b="0"/>
+            <wp:docPr id="8" name="Imagen 8"/>
+            <wp:cNvGraphicFramePr>
+              <a:graphicFrameLocks xmlns:a="http://schemas.openxmlformats.org/drawingml/2006/main" noChangeAspect="1"/>
+            </wp:cNvGraphicFramePr>
+            <a:graphic xmlns:a="http://schemas.openxmlformats.org/drawingml/2006/main">
+              <a:graphicData uri="http://schemas.openxmlformats.org/drawingml/2006/picture">
+                <pic:pic xmlns:pic="http://schemas.openxmlformats.org/drawingml/2006/picture">
+                  <pic:nvPicPr>
+                    <pic:cNvPr id="1" name=""/>
+                    <pic:cNvPicPr/>
+                  </pic:nvPicPr>
+                  <pic:blipFill rotWithShape="1">
+                    <a:blip r:embed="rId11"/>
+                    <a:srcRect r="33244" b="11570"/>
+                    <a:stretch/>
+                  </pic:blipFill>
+                  <pic:spPr bwMode="auto">
+                    <a:xfrm>
+                      <a:off x="0" y="0"/>
+                      <a:ext cx="2554035" cy="2039416"/>
+                    </a:xfrm>
+                    <a:prstGeom prst="rect">
+                      <a:avLst/>
+                    </a:prstGeom>
+                    <a:ln>
+                      <a:noFill/>
+                    </a:ln>
+                    <a:extLst>
+                      <a:ext uri="{53640926-AAD7-44D8-BBD7-CCE9431645EC}">
+                        <a14:shadowObscured xmlns:a14="http://schemas.microsoft.com/office/drawing/2010/main"/>
+                      </a:ext>
+                    </a:extLst>
+                  </pic:spPr>
+                </pic:pic>
+              </a:graphicData>
+            </a:graphic>
+          </wp:inline>
+        </w:drawing>
+      </w:r>
+    </w:p>
+    <w:p>
+      <w:pPr>
+        <w:pStyle w:val="Default"/>
+      </w:pPr>
+    </w:p>
+    <w:p>
+      <w:pPr>
+        <w:pStyle w:val="Default"/>
+      </w:pPr>
+      <w:r>
+        <w:t xml:space="preserve"> </w:t>
+      </w:r>
+    </w:p>
+    <w:p>
+      <w:pPr>
+        <w:pStyle w:val="Default"/>
+        <w:rPr>
+          <w:sz w:val="23"/>
+          <w:szCs w:val="23"/>
+        </w:rPr>
+      </w:pPr>
+      <w:r>
+        <w:rPr>
+          <w:sz w:val="23"/>
+          <w:szCs w:val="23"/>
+        </w:rPr>
+        <w:t>5.</w:t>
+      </w:r>
+      <w:r>
+        <w:rPr>
+          <w:sz w:val="23"/>
+          <w:szCs w:val="23"/>
+        </w:rPr>
+        <w:t xml:space="preserve">En la rama2 se debe crear hacer un test con dos validaciones para calcular la factorial de un número. </w:t>
+      </w:r>
+    </w:p>
+    <w:p>
+      <w:r>
+        <w:lastRenderedPageBreak/>
+        <w:drawing>
+          <wp:inline distT="0" distB="0" distL="0" distR="0" wp14:anchorId="798E0BE0" wp14:editId="596A8DE1">
+            <wp:extent cx="3962953" cy="1886213"/>
+            <wp:effectExtent l="0" t="0" r="0" b="0"/>
+            <wp:docPr id="9" name="Imagen 9"/>
+            <wp:cNvGraphicFramePr>
+              <a:graphicFrameLocks xmlns:a="http://schemas.openxmlformats.org/drawingml/2006/main" noChangeAspect="1"/>
+            </wp:cNvGraphicFramePr>
+            <a:graphic xmlns:a="http://schemas.openxmlformats.org/drawingml/2006/main">
+              <a:graphicData uri="http://schemas.openxmlformats.org/drawingml/2006/picture">
+                <pic:pic xmlns:pic="http://schemas.openxmlformats.org/drawingml/2006/picture">
+                  <pic:nvPicPr>
+                    <pic:cNvPr id="1" name=""/>
+                    <pic:cNvPicPr/>
+                  </pic:nvPicPr>
+                  <pic:blipFill>
+                    <a:blip r:embed="rId12"/>
+                    <a:stretch>
+                      <a:fillRect/>
+                    </a:stretch>
+                  </pic:blipFill>
+                  <pic:spPr>
+                    <a:xfrm>
+                      <a:off x="0" y="0"/>
+                      <a:ext cx="3962953" cy="1886213"/>
+                    </a:xfrm>
+                    <a:prstGeom prst="rect">
+                      <a:avLst/>
+                    </a:prstGeom>
+                  </pic:spPr>
+                </pic:pic>
+              </a:graphicData>
+            </a:graphic>
+          </wp:inline>
+        </w:drawing>
+      </w:r>
+      <w:r>
+        <w:drawing>
+          <wp:inline distT="0" distB="0" distL="0" distR="0" wp14:anchorId="2820C539" wp14:editId="0C3AF447">
+            <wp:extent cx="3305636" cy="1867161"/>
+            <wp:effectExtent l="0" t="0" r="0" b="0"/>
+            <wp:docPr id="10" name="Imagen 10"/>
+            <wp:cNvGraphicFramePr>
+              <a:graphicFrameLocks xmlns:a="http://schemas.openxmlformats.org/drawingml/2006/main" noChangeAspect="1"/>
+            </wp:cNvGraphicFramePr>
+            <a:graphic xmlns:a="http://schemas.openxmlformats.org/drawingml/2006/main">
+              <a:graphicData uri="http://schemas.openxmlformats.org/drawingml/2006/picture">
+                <pic:pic xmlns:pic="http://schemas.openxmlformats.org/drawingml/2006/picture">
+                  <pic:nvPicPr>
+                    <pic:cNvPr id="1" name=""/>
+                    <pic:cNvPicPr/>
+                  </pic:nvPicPr>
+                  <pic:blipFill>
+                    <a:blip r:embed="rId13"/>
+                    <a:stretch>
+                      <a:fillRect/>
+                    </a:stretch>
+                  </pic:blipFill>
+                  <pic:spPr>
+                    <a:xfrm>
+                      <a:off x="0" y="0"/>
+                      <a:ext cx="3305636" cy="1867161"/>
+                    </a:xfrm>
+                    <a:prstGeom prst="rect">
+                      <a:avLst/>
+                    </a:prstGeom>
+                  </pic:spPr>
+                </pic:pic>
+              </a:graphicData>
+            </a:graphic>
+          </wp:inline>
+        </w:drawing>
+      </w:r>
+      <w:r>
+        <w:drawing>
+          <wp:inline distT="0" distB="0" distL="0" distR="0" wp14:anchorId="0DE90737" wp14:editId="3FC68393">
+            <wp:extent cx="4353533" cy="3458058"/>
+            <wp:effectExtent l="0" t="0" r="9525" b="9525"/>
+            <wp:docPr id="11" name="Imagen 11"/>
+            <wp:cNvGraphicFramePr>
+              <a:graphicFrameLocks xmlns:a="http://schemas.openxmlformats.org/drawingml/2006/main" noChangeAspect="1"/>
+            </wp:cNvGraphicFramePr>
+            <a:graphic xmlns:a="http://schemas.openxmlformats.org/drawingml/2006/main">
+              <a:graphicData uri="http://schemas.openxmlformats.org/drawingml/2006/picture">
+                <pic:pic xmlns:pic="http://schemas.openxmlformats.org/drawingml/2006/picture">
+                  <pic:nvPicPr>
+                    <pic:cNvPr id="1" name=""/>
+                    <pic:cNvPicPr/>
+                  </pic:nvPicPr>
+                  <pic:blipFill>
+                    <a:blip r:embed="rId14"/>
+                    <a:stretch>
+                      <a:fillRect/>
+                    </a:stretch>
+                  </pic:blipFill>
+                  <pic:spPr>
+                    <a:xfrm>
+                      <a:off x="0" y="0"/>
+                      <a:ext cx="4353533" cy="3458058"/>
+                    </a:xfrm>
+                    <a:prstGeom prst="rect">
+                      <a:avLst/>
+                    </a:prstGeom>
+                  </pic:spPr>
+                </pic:pic>
+              </a:graphicData>
+            </a:graphic>
+          </wp:inline>
+        </w:drawing>
+      </w:r>
+    </w:p>
+    <w:p>
+      <w:pPr>
+        <w:autoSpaceDE w:val="0"/>
+        <w:autoSpaceDN w:val="0"/>
+        <w:adjustRightInd w:val="0"/>
+        <w:spacing w:after="0" w:line="240" w:lineRule="auto"/>
+        <w:rPr>
+          <w:rFonts w:ascii="Arial" w:hAnsi="Arial" w:cs="Arial"/>
+          <w:color w:val="000000"/>
+          <w:sz w:val="24"/>
+          <w:szCs w:val="24"/>
+        </w:rPr>
+      </w:pPr>
+    </w:p>
+    <w:p>
+      <w:pPr>
+        <w:autoSpaceDE w:val="0"/>
+        <w:autoSpaceDN w:val="0"/>
+        <w:adjustRightInd w:val="0"/>
+        <w:spacing w:after="0" w:line="240" w:lineRule="auto"/>
+        <w:rPr>
+          <w:rFonts w:ascii="Arial" w:hAnsi="Arial" w:cs="Arial"/>
+          <w:color w:val="000000"/>
+          <w:sz w:val="24"/>
+          <w:szCs w:val="24"/>
+        </w:rPr>
+      </w:pPr>
+      <w:r>
+        <w:rPr>
+          <w:rFonts w:ascii="Arial" w:hAnsi="Arial" w:cs="Arial"/>
+          <w:color w:val="000000"/>
+          <w:sz w:val="24"/>
+          <w:szCs w:val="24"/>
+        </w:rPr>
+        <w:t xml:space="preserve"> </w:t>
+      </w:r>
+    </w:p>
+    <w:p>
+      <w:pPr>
+        <w:autoSpaceDE w:val="0"/>
+        <w:autoSpaceDN w:val="0"/>
+        <w:adjustRightInd w:val="0"/>
+        <w:spacing w:after="0" w:line="240" w:lineRule="auto"/>
+        <w:rPr>
+          <w:rFonts w:ascii="Arial" w:hAnsi="Arial" w:cs="Arial"/>
+          <w:color w:val="000000"/>
+          <w:sz w:val="23"/>
+          <w:szCs w:val="23"/>
+        </w:rPr>
+      </w:pPr>
+      <w:r>
+        <w:rPr>
+          <w:rFonts w:ascii="Arial" w:hAnsi="Arial" w:cs="Arial"/>
+          <w:color w:val="000000"/>
+          <w:sz w:val="23"/>
+          <w:szCs w:val="23"/>
+        </w:rPr>
+        <w:t>6.</w:t>
+      </w:r>
+      <w:r>
+        <w:rPr>
+          <w:rFonts w:ascii="Arial" w:hAnsi="Arial" w:cs="Arial"/>
+          <w:color w:val="000000"/>
+          <w:sz w:val="23"/>
+          <w:szCs w:val="23"/>
+        </w:rPr>
+        <w:t xml:space="preserve">Suba al GitHub las ramas </w:t>
+      </w:r>
+      <w:proofErr w:type="spellStart"/>
+      <w:r>
+        <w:rPr>
+          <w:rFonts w:ascii="Arial" w:hAnsi="Arial" w:cs="Arial"/>
+          <w:color w:val="000000"/>
+          <w:sz w:val="23"/>
+          <w:szCs w:val="23"/>
+        </w:rPr>
+        <w:t>main</w:t>
+      </w:r>
+      <w:proofErr w:type="spellEnd"/>
+      <w:r>
+        <w:rPr>
+          <w:rFonts w:ascii="Arial" w:hAnsi="Arial" w:cs="Arial"/>
+          <w:color w:val="000000"/>
+          <w:sz w:val="23"/>
+          <w:szCs w:val="23"/>
+        </w:rPr>
+        <w:t xml:space="preserve">, rama1 y rama 2. </w:t>
+      </w:r>
+    </w:p>
+    <w:p>
+      <w:r>
+        <w:lastRenderedPageBreak/>
+        <w:drawing>
+          <wp:inline distT="0" distB="0" distL="0" distR="0" wp14:anchorId="3FFB1290" wp14:editId="1E03F89A">
+            <wp:extent cx="4744112" cy="943107"/>
+            <wp:effectExtent l="0" t="0" r="0" b="9525"/>
+            <wp:docPr id="12" name="Imagen 12"/>
+            <wp:cNvGraphicFramePr>
+              <a:graphicFrameLocks xmlns:a="http://schemas.openxmlformats.org/drawingml/2006/main" noChangeAspect="1"/>
+            </wp:cNvGraphicFramePr>
+            <a:graphic xmlns:a="http://schemas.openxmlformats.org/drawingml/2006/main">
+              <a:graphicData uri="http://schemas.openxmlformats.org/drawingml/2006/picture">
+                <pic:pic xmlns:pic="http://schemas.openxmlformats.org/drawingml/2006/picture">
+                  <pic:nvPicPr>
+                    <pic:cNvPr id="1" name=""/>
+                    <pic:cNvPicPr/>
+                  </pic:nvPicPr>
+                  <pic:blipFill>
+                    <a:blip r:embed="rId15"/>
+                    <a:stretch>
+                      <a:fillRect/>
+                    </a:stretch>
+                  </pic:blipFill>
+                  <pic:spPr>
+                    <a:xfrm>
+                      <a:off x="0" y="0"/>
+                      <a:ext cx="4744112" cy="943107"/>
+                    </a:xfrm>
+                    <a:prstGeom prst="rect">
+                      <a:avLst/>
+                    </a:prstGeom>
+                  </pic:spPr>
+                </pic:pic>
+              </a:graphicData>
+            </a:graphic>
+          </wp:inline>
+        </w:drawing>
+      </w:r>
+      <w:r>
+        <w:drawing>
+          <wp:inline distT="0" distB="0" distL="0" distR="0" wp14:anchorId="051A49F2" wp14:editId="5C9370C6">
+            <wp:extent cx="5363323" cy="7097115"/>
+            <wp:effectExtent l="0" t="0" r="8890" b="8890"/>
+            <wp:docPr id="13" name="Imagen 13"/>
+            <wp:cNvGraphicFramePr>
+              <a:graphicFrameLocks xmlns:a="http://schemas.openxmlformats.org/drawingml/2006/main" noChangeAspect="1"/>
+            </wp:cNvGraphicFramePr>
+            <a:graphic xmlns:a="http://schemas.openxmlformats.org/drawingml/2006/main">
+              <a:graphicData uri="http://schemas.openxmlformats.org/drawingml/2006/picture">
+                <pic:pic xmlns:pic="http://schemas.openxmlformats.org/drawingml/2006/picture">
+                  <pic:nvPicPr>
+                    <pic:cNvPr id="1" name=""/>
+                    <pic:cNvPicPr/>
+                  </pic:nvPicPr>
+                  <pic:blipFill>
+                    <a:blip r:embed="rId16"/>
+                    <a:stretch>
+                      <a:fillRect/>
+                    </a:stretch>
+                  </pic:blipFill>
+                  <pic:spPr>
+                    <a:xfrm>
+                      <a:off x="0" y="0"/>
+                      <a:ext cx="5363323" cy="7097115"/>
+                    </a:xfrm>
+                    <a:prstGeom prst="rect">
+                      <a:avLst/>
+                    </a:prstGeom>
+                  </pic:spPr>
+                </pic:pic>
+              </a:graphicData>
+            </a:graphic>
+          </wp:inline>
+        </w:drawing>
+      </w:r>
+    </w:p>
+    <w:p>
+      <w:pPr>
+        <w:autoSpaceDE w:val="0"/>
+        <w:autoSpaceDN w:val="0"/>
+        <w:adjustRightInd w:val="0"/>
+        <w:spacing w:after="0" w:line="240" w:lineRule="auto"/>
+        <w:rPr>
+          <w:rFonts w:ascii="Arial" w:hAnsi="Arial" w:cs="Arial"/>
+          <w:color w:val="000000"/>
+          <w:sz w:val="24"/>
+          <w:szCs w:val="24"/>
+        </w:rPr>
+      </w:pPr>
+    </w:p>
+    <w:p>
+      <w:pPr>
+        <w:autoSpaceDE w:val="0"/>
+        <w:autoSpaceDN w:val="0"/>
+        <w:adjustRightInd w:val="0"/>
+        <w:spacing w:after="0" w:line="240" w:lineRule="auto"/>
+        <w:rPr>
+          <w:rFonts w:ascii="Arial" w:hAnsi="Arial" w:cs="Arial"/>
+          <w:color w:val="000000"/>
+          <w:sz w:val="24"/>
+          <w:szCs w:val="24"/>
+        </w:rPr>
+      </w:pPr>
+      <w:r>
+        <w:rPr>
+          <w:rFonts w:ascii="Arial" w:hAnsi="Arial" w:cs="Arial"/>
+          <w:color w:val="000000"/>
+          <w:sz w:val="24"/>
+          <w:szCs w:val="24"/>
+        </w:rPr>
+        <w:t xml:space="preserve"> </w:t>
+      </w:r>
+    </w:p>
+    <w:p>
+      <w:pPr>
+        <w:autoSpaceDE w:val="0"/>
+        <w:autoSpaceDN w:val="0"/>
+        <w:adjustRightInd w:val="0"/>
+        <w:spacing w:after="0" w:line="240" w:lineRule="auto"/>
+        <w:rPr>
+          <w:rFonts w:ascii="Arial" w:hAnsi="Arial" w:cs="Arial"/>
+          <w:color w:val="000000"/>
+          <w:sz w:val="23"/>
+          <w:szCs w:val="23"/>
+        </w:rPr>
+      </w:pPr>
+      <w:r>
+        <w:rPr>
+          <w:rFonts w:ascii="Arial" w:hAnsi="Arial" w:cs="Arial"/>
+          <w:color w:val="000000"/>
+          <w:sz w:val="23"/>
+          <w:szCs w:val="23"/>
+        </w:rPr>
+        <w:t>7.</w:t>
+      </w:r>
+      <w:r>
+        <w:rPr>
+          <w:rFonts w:ascii="Arial" w:hAnsi="Arial" w:cs="Arial"/>
+          <w:color w:val="000000"/>
+          <w:sz w:val="23"/>
+          <w:szCs w:val="23"/>
+        </w:rPr>
+        <w:t xml:space="preserve">Realice un </w:t>
+      </w:r>
+      <w:proofErr w:type="spellStart"/>
+      <w:r>
+        <w:rPr>
+          <w:rFonts w:ascii="Arial" w:hAnsi="Arial" w:cs="Arial"/>
+          <w:color w:val="000000"/>
+          <w:sz w:val="23"/>
+          <w:szCs w:val="23"/>
+        </w:rPr>
+        <w:t>Pull</w:t>
+      </w:r>
+      <w:proofErr w:type="spellEnd"/>
+      <w:r>
+        <w:rPr>
+          <w:rFonts w:ascii="Arial" w:hAnsi="Arial" w:cs="Arial"/>
+          <w:color w:val="000000"/>
+          <w:sz w:val="23"/>
+          <w:szCs w:val="23"/>
+        </w:rPr>
+        <w:t xml:space="preserve"> </w:t>
+      </w:r>
+      <w:proofErr w:type="spellStart"/>
+      <w:r>
+        <w:rPr>
+          <w:rFonts w:ascii="Arial" w:hAnsi="Arial" w:cs="Arial"/>
+          <w:color w:val="000000"/>
+          <w:sz w:val="23"/>
+          <w:szCs w:val="23"/>
+        </w:rPr>
+        <w:t>request</w:t>
+      </w:r>
+      <w:proofErr w:type="spellEnd"/>
+      <w:r>
+        <w:rPr>
+          <w:rFonts w:ascii="Arial" w:hAnsi="Arial" w:cs="Arial"/>
+          <w:color w:val="000000"/>
+          <w:sz w:val="23"/>
+          <w:szCs w:val="23"/>
+        </w:rPr>
+        <w:t xml:space="preserve"> (</w:t>
+      </w:r>
+      <w:proofErr w:type="spellStart"/>
+      <w:r>
+        <w:rPr>
+          <w:rFonts w:ascii="Arial" w:hAnsi="Arial" w:cs="Arial"/>
+          <w:color w:val="000000"/>
+          <w:sz w:val="23"/>
+          <w:szCs w:val="23"/>
+        </w:rPr>
+        <w:t>merge</w:t>
+      </w:r>
+      <w:proofErr w:type="spellEnd"/>
+      <w:r>
+        <w:rPr>
+          <w:rFonts w:ascii="Arial" w:hAnsi="Arial" w:cs="Arial"/>
+          <w:color w:val="000000"/>
+          <w:sz w:val="23"/>
+          <w:szCs w:val="23"/>
+        </w:rPr>
+        <w:t xml:space="preserve">) en el repositorio remoto. </w:t>
+      </w:r>
+    </w:p>
+    <w:p>
+      <w:r>
+        <w:drawing>
+          <wp:inline distT="0" distB="0" distL="0" distR="0" wp14:anchorId="66E0CC3B" wp14:editId="6358A866">
+            <wp:extent cx="5943600" cy="821055"/>
+            <wp:effectExtent l="0" t="0" r="0" b="0"/>
+            <wp:docPr id="14" name="Imagen 14"/>
+            <wp:cNvGraphicFramePr>
+              <a:graphicFrameLocks xmlns:a="http://schemas.openxmlformats.org/drawingml/2006/main" noChangeAspect="1"/>
+            </wp:cNvGraphicFramePr>
+            <a:graphic xmlns:a="http://schemas.openxmlformats.org/drawingml/2006/main">
+              <a:graphicData uri="http://schemas.openxmlformats.org/drawingml/2006/picture">
+                <pic:pic xmlns:pic="http://schemas.openxmlformats.org/drawingml/2006/picture">
+                  <pic:nvPicPr>
+                    <pic:cNvPr id="1" name=""/>
+                    <pic:cNvPicPr/>
+                  </pic:nvPicPr>
+                  <pic:blipFill>
+                    <a:blip r:embed="rId17"/>
+                    <a:stretch>
+                      <a:fillRect/>
+                    </a:stretch>
+                  </pic:blipFill>
+                  <pic:spPr>
+                    <a:xfrm>
+                      <a:off x="0" y="0"/>
+                      <a:ext cx="5943600" cy="821055"/>
+                    </a:xfrm>
+                    <a:prstGeom prst="rect">
+                      <a:avLst/>
+                    </a:prstGeom>
+                  </pic:spPr>
+                </pic:pic>
+              </a:graphicData>
+            </a:graphic>
+          </wp:inline>
+        </w:drawing>
+      </w:r>
+      <w:r>
+        <w:drawing>
+          <wp:inline distT="0" distB="0" distL="0" distR="0" wp14:anchorId="6BB0FDC8" wp14:editId="12A7C286">
+            <wp:extent cx="5943600" cy="5220335"/>
+            <wp:effectExtent l="0" t="0" r="0" b="0"/>
+            <wp:docPr id="15" name="Imagen 15"/>
+            <wp:cNvGraphicFramePr>
+              <a:graphicFrameLocks xmlns:a="http://schemas.openxmlformats.org/drawingml/2006/main" noChangeAspect="1"/>
+            </wp:cNvGraphicFramePr>
+            <a:graphic xmlns:a="http://schemas.openxmlformats.org/drawingml/2006/main">
+              <a:graphicData uri="http://schemas.openxmlformats.org/drawingml/2006/picture">
+                <pic:pic xmlns:pic="http://schemas.openxmlformats.org/drawingml/2006/picture">
+                  <pic:nvPicPr>
+                    <pic:cNvPr id="1" name=""/>
+                    <pic:cNvPicPr/>
+                  </pic:nvPicPr>
+                  <pic:blipFill>
+                    <a:blip r:embed="rId18"/>
+                    <a:stretch>
+                      <a:fillRect/>
+                    </a:stretch>
+                  </pic:blipFill>
+                  <pic:spPr>
+                    <a:xfrm>
+                      <a:off x="0" y="0"/>
+                      <a:ext cx="5943600" cy="5220335"/>
+                    </a:xfrm>
+                    <a:prstGeom prst="rect">
+                      <a:avLst/>
+                    </a:prstGeom>
+                  </pic:spPr>
+                </pic:pic>
+              </a:graphicData>
+            </a:graphic>
+          </wp:inline>
+        </w:drawing>
+      </w:r>
+      <w:r>
+        <w:lastRenderedPageBreak/>
+        <w:drawing>
+          <wp:inline distT="0" distB="0" distL="0" distR="0" wp14:anchorId="7256ECF7" wp14:editId="32009BE1">
+            <wp:extent cx="5943600" cy="2786380"/>
+            <wp:effectExtent l="0" t="0" r="0" b="0"/>
+            <wp:docPr id="16" name="Imagen 16"/>
+            <wp:cNvGraphicFramePr>
+              <a:graphicFrameLocks xmlns:a="http://schemas.openxmlformats.org/drawingml/2006/main" noChangeAspect="1"/>
+            </wp:cNvGraphicFramePr>
+            <a:graphic xmlns:a="http://schemas.openxmlformats.org/drawingml/2006/main">
+              <a:graphicData uri="http://schemas.openxmlformats.org/drawingml/2006/picture">
+                <pic:pic xmlns:pic="http://schemas.openxmlformats.org/drawingml/2006/picture">
+                  <pic:nvPicPr>
+                    <pic:cNvPr id="1" name=""/>
+                    <pic:cNvPicPr/>
+                  </pic:nvPicPr>
+                  <pic:blipFill>
+                    <a:blip r:embed="rId19"/>
+                    <a:stretch>
+                      <a:fillRect/>
+                    </a:stretch>
+                  </pic:blipFill>
+                  <pic:spPr>
+                    <a:xfrm>
+                      <a:off x="0" y="0"/>
+                      <a:ext cx="5943600" cy="2786380"/>
+                    </a:xfrm>
+                    <a:prstGeom prst="rect">
+                      <a:avLst/>
+                    </a:prstGeom>
+                  </pic:spPr>
+                </pic:pic>
+              </a:graphicData>
+            </a:graphic>
+          </wp:inline>
+        </w:drawing>
+      </w:r>
+      <w:r>
+        <w:drawing>
+          <wp:inline distT="0" distB="0" distL="0" distR="0" wp14:anchorId="07A275DE" wp14:editId="04E420D3">
+            <wp:extent cx="5943600" cy="5186680"/>
+            <wp:effectExtent l="0" t="0" r="0" b="0"/>
+            <wp:docPr id="17" name="Imagen 17"/>
+            <wp:cNvGraphicFramePr>
+              <a:graphicFrameLocks xmlns:a="http://schemas.openxmlformats.org/drawingml/2006/main" noChangeAspect="1"/>
+            </wp:cNvGraphicFramePr>
+            <a:graphic xmlns:a="http://schemas.openxmlformats.org/drawingml/2006/main">
+              <a:graphicData uri="http://schemas.openxmlformats.org/drawingml/2006/picture">
+                <pic:pic xmlns:pic="http://schemas.openxmlformats.org/drawingml/2006/picture">
+                  <pic:nvPicPr>
+                    <pic:cNvPr id="1" name=""/>
+                    <pic:cNvPicPr/>
+                  </pic:nvPicPr>
+                  <pic:blipFill>
+                    <a:blip r:embed="rId20"/>
+                    <a:stretch>
+                      <a:fillRect/>
+                    </a:stretch>
+                  </pic:blipFill>
+                  <pic:spPr>
+                    <a:xfrm>
+                      <a:off x="0" y="0"/>
+                      <a:ext cx="5943600" cy="5186680"/>
+                    </a:xfrm>
+                    <a:prstGeom prst="rect">
+                      <a:avLst/>
+                    </a:prstGeom>
+                  </pic:spPr>
+                </pic:pic>
+              </a:graphicData>
+            </a:graphic>
+          </wp:inline>
+        </w:drawing>
+      </w:r>
+      <w:r>
+        <w:lastRenderedPageBreak/>
+        <w:drawing>
+          <wp:inline distT="0" distB="0" distL="0" distR="0" wp14:anchorId="524B0CAC" wp14:editId="4AE625BD">
+            <wp:extent cx="5943600" cy="3227070"/>
+            <wp:effectExtent l="0" t="0" r="0" b="0"/>
+            <wp:docPr id="19" name="Imagen 19"/>
+            <wp:cNvGraphicFramePr>
+              <a:graphicFrameLocks xmlns:a="http://schemas.openxmlformats.org/drawingml/2006/main" noChangeAspect="1"/>
+            </wp:cNvGraphicFramePr>
+            <a:graphic xmlns:a="http://schemas.openxmlformats.org/drawingml/2006/main">
+              <a:graphicData uri="http://schemas.openxmlformats.org/drawingml/2006/picture">
+                <pic:pic xmlns:pic="http://schemas.openxmlformats.org/drawingml/2006/picture">
+                  <pic:nvPicPr>
+                    <pic:cNvPr id="1" name=""/>
+                    <pic:cNvPicPr/>
+                  </pic:nvPicPr>
+                  <pic:blipFill>
+                    <a:blip r:embed="rId21"/>
+                    <a:stretch>
+                      <a:fillRect/>
+                    </a:stretch>
+                  </pic:blipFill>
+                  <pic:spPr>
+                    <a:xfrm>
+                      <a:off x="0" y="0"/>
+                      <a:ext cx="5943600" cy="3227070"/>
+                    </a:xfrm>
+                    <a:prstGeom prst="rect">
+                      <a:avLst/>
+                    </a:prstGeom>
+                  </pic:spPr>
+                </pic:pic>
+              </a:graphicData>
+            </a:graphic>
+          </wp:inline>
+        </w:drawing>
+      </w:r>
+      <w:r>
+        <w:drawing>
+          <wp:inline distT="0" distB="0" distL="0" distR="0" wp14:anchorId="50EB0AD6" wp14:editId="32CBFA2F">
+            <wp:extent cx="5943600" cy="4789805"/>
+            <wp:effectExtent l="0" t="0" r="0" b="0"/>
+            <wp:docPr id="20" name="Imagen 20"/>
+            <wp:cNvGraphicFramePr>
+              <a:graphicFrameLocks xmlns:a="http://schemas.openxmlformats.org/drawingml/2006/main" noChangeAspect="1"/>
+            </wp:cNvGraphicFramePr>
+            <a:graphic xmlns:a="http://schemas.openxmlformats.org/drawingml/2006/main">
+              <a:graphicData uri="http://schemas.openxmlformats.org/drawingml/2006/picture">
+                <pic:pic xmlns:pic="http://schemas.openxmlformats.org/drawingml/2006/picture">
+                  <pic:nvPicPr>
+                    <pic:cNvPr id="1" name=""/>
+                    <pic:cNvPicPr/>
+                  </pic:nvPicPr>
+                  <pic:blipFill>
+                    <a:blip r:embed="rId22"/>
+                    <a:stretch>
+                      <a:fillRect/>
+                    </a:stretch>
+                  </pic:blipFill>
+                  <pic:spPr>
+                    <a:xfrm>
+                      <a:off x="0" y="0"/>
+                      <a:ext cx="5943600" cy="4789805"/>
+                    </a:xfrm>
+                    <a:prstGeom prst="rect">
+                      <a:avLst/>
+                    </a:prstGeom>
+                  </pic:spPr>
+                </pic:pic>
+              </a:graphicData>
+            </a:graphic>
+          </wp:inline>
+        </w:drawing>
+      </w:r>
+      <w:r>
+        <w:lastRenderedPageBreak/>
+        <w:drawing>
+          <wp:inline distT="0" distB="0" distL="0" distR="0" wp14:anchorId="2E1C9E43" wp14:editId="7FF67113">
+            <wp:extent cx="5943600" cy="2785110"/>
+            <wp:effectExtent l="0" t="0" r="0" b="0"/>
+            <wp:docPr id="21" name="Imagen 21"/>
+            <wp:cNvGraphicFramePr>
+              <a:graphicFrameLocks xmlns:a="http://schemas.openxmlformats.org/drawingml/2006/main" noChangeAspect="1"/>
+            </wp:cNvGraphicFramePr>
+            <a:graphic xmlns:a="http://schemas.openxmlformats.org/drawingml/2006/main">
+              <a:graphicData uri="http://schemas.openxmlformats.org/drawingml/2006/picture">
+                <pic:pic xmlns:pic="http://schemas.openxmlformats.org/drawingml/2006/picture">
+                  <pic:nvPicPr>
+                    <pic:cNvPr id="1" name=""/>
+                    <pic:cNvPicPr/>
+                  </pic:nvPicPr>
+                  <pic:blipFill>
+                    <a:blip r:embed="rId23"/>
+                    <a:stretch>
+                      <a:fillRect/>
+                    </a:stretch>
+                  </pic:blipFill>
+                  <pic:spPr>
+                    <a:xfrm>
+                      <a:off x="0" y="0"/>
+                      <a:ext cx="5943600" cy="2785110"/>
+                    </a:xfrm>
+                    <a:prstGeom prst="rect">
+                      <a:avLst/>
+                    </a:prstGeom>
+                  </pic:spPr>
+                </pic:pic>
+              </a:graphicData>
+            </a:graphic>
+          </wp:inline>
+        </w:drawing>
+      </w:r>
+      <w:r>
+        <w:drawing>
+          <wp:inline distT="0" distB="0" distL="0" distR="0" wp14:anchorId="14BC7D34" wp14:editId="37B10717">
+            <wp:extent cx="5943600" cy="4684395"/>
+            <wp:effectExtent l="0" t="0" r="0" b="1905"/>
+            <wp:docPr id="22" name="Imagen 22"/>
+            <wp:cNvGraphicFramePr>
+              <a:graphicFrameLocks xmlns:a="http://schemas.openxmlformats.org/drawingml/2006/main" noChangeAspect="1"/>
+            </wp:cNvGraphicFramePr>
+            <a:graphic xmlns:a="http://schemas.openxmlformats.org/drawingml/2006/main">
+              <a:graphicData uri="http://schemas.openxmlformats.org/drawingml/2006/picture">
+                <pic:pic xmlns:pic="http://schemas.openxmlformats.org/drawingml/2006/picture">
+                  <pic:nvPicPr>
+                    <pic:cNvPr id="1" name=""/>
+                    <pic:cNvPicPr/>
+                  </pic:nvPicPr>
+                  <pic:blipFill>
+                    <a:blip r:embed="rId24"/>
+                    <a:stretch>
+                      <a:fillRect/>
+                    </a:stretch>
+                  </pic:blipFill>
+                  <pic:spPr>
+                    <a:xfrm>
+                      <a:off x="0" y="0"/>
+                      <a:ext cx="5943600" cy="4684395"/>
+                    </a:xfrm>
+                    <a:prstGeom prst="rect">
+                      <a:avLst/>
+                    </a:prstGeom>
+                  </pic:spPr>
+                </pic:pic>
+              </a:graphicData>
+            </a:graphic>
+          </wp:inline>
+        </w:drawing>
+      </w:r>
+    </w:p>
     <w:sectPr>
       <w:pgSz w:w="12240" w:h="15840"/>
       <w:pgMar w:top="1440" w:right="1440" w:bottom="1440" w:left="1440" w:header="708" w:footer="708" w:gutter="0"/>
@@ -903,6 +1770,173 @@
     </w:sectPr>
   </w:body>
 </w:document>
+</file>
+
+<file path=word/numbering.xml><?xml version="1.0" encoding="utf-8"?>
+<w:numbering xmlns:wpc="http://schemas.microsoft.com/office/word/2010/wordprocessingCanvas" xmlns:cx="http://schemas.microsoft.com/office/drawing/2014/chartex" xmlns:cx1="http://schemas.microsoft.com/office/drawing/2015/9/8/chartex" xmlns:cx2="http://schemas.microsoft.com/office/drawing/2015/10/21/chartex" xmlns:cx3="http://schemas.microsoft.com/office/drawing/2016/5/9/chartex" xmlns:cx4="http://schemas.microsoft.com/office/drawing/2016/5/10/chartex" xmlns:cx5="http://schemas.microsoft.com/office/drawing/2016/5/11/chartex" xmlns:cx6="http://schemas.microsoft.com/office/drawing/2016/5/12/chartex" xmlns:cx7="http://schemas.microsoft.com/office/drawing/2016/5/13/chartex" xmlns:cx8="http://schemas.microsoft.com/office/drawing/2016/5/14/chartex" xmlns:mc="http://schemas.openxmlformats.org/markup-compatibility/2006" xmlns:aink="http://schemas.microsoft.com/office/drawing/2016/ink" xmlns:am3d="http://schemas.microsoft.com/office/drawing/2017/model3d" xmlns:o="urn:schemas-microsoft-com:office:office" xmlns:r="http://schemas.openxmlformats.org/officeDocument/2006/relationships" xmlns:m="http://schemas.openxmlformats.org/officeDocument/2006/math" xmlns:v="urn:schemas-microsoft-com:vml" xmlns:wp14="http://schemas.microsoft.com/office/word/2010/wordprocessingDrawing" xmlns:wp="http://schemas.openxmlformats.org/drawingml/2006/wordprocessingDrawing" xmlns:w10="urn:schemas-microsoft-com:office:word" xmlns:w="http://schemas.openxmlformats.org/wordprocessingml/2006/main" xmlns:w14="http://schemas.microsoft.com/office/word/2010/wordml" xmlns:w15="http://schemas.microsoft.com/office/word/2012/wordml" xmlns:w16cex="http://schemas.microsoft.com/office/word/2018/wordml/cex" xmlns:w16cid="http://schemas.microsoft.com/office/word/2016/wordml/cid" xmlns:w16="http://schemas.microsoft.com/office/word/2018/wordml" xmlns:w16sdtdh="http://schemas.microsoft.com/office/word/2020/wordml/sdtdatahash" xmlns:w16se="http://schemas.microsoft.com/office/word/2015/wordml/symex" xmlns:wpg="http://schemas.microsoft.com/office/word/2010/wordprocessingGroup" xmlns:wpi="http://schemas.microsoft.com/office/word/2010/wordprocessingInk" xmlns:wne="http://schemas.microsoft.com/office/word/2006/wordml" xmlns:wps="http://schemas.microsoft.com/office/word/2010/wordprocessingShape" mc:Ignorable="w14 w15 w16se w16cid w16 w16cex w16sdtdh wp14">
+  <w:abstractNum w:abstractNumId="0" w15:restartNumberingAfterBreak="0">
+    <w:nsid w:val="B57B3BFE"/>
+    <w:multiLevelType w:val="hybridMultilevel"/>
+    <w:tmpl w:val="D09C8FF1"/>
+    <w:lvl w:ilvl="0" w:tplc="FFFFFFFF">
+      <w:start w:val="1"/>
+      <w:numFmt w:val="decimal"/>
+      <w:lvlText w:val="%1."/>
+      <w:lvlJc w:val="left"/>
+    </w:lvl>
+    <w:lvl w:ilvl="1" w:tplc="FFFFFFFF">
+      <w:numFmt w:val="decimal"/>
+      <w:lvlText w:val=""/>
+      <w:lvlJc w:val="left"/>
+    </w:lvl>
+    <w:lvl w:ilvl="2" w:tplc="FFFFFFFF">
+      <w:numFmt w:val="decimal"/>
+      <w:lvlText w:val=""/>
+      <w:lvlJc w:val="left"/>
+    </w:lvl>
+    <w:lvl w:ilvl="3" w:tplc="FFFFFFFF">
+      <w:numFmt w:val="decimal"/>
+      <w:lvlText w:val=""/>
+      <w:lvlJc w:val="left"/>
+    </w:lvl>
+    <w:lvl w:ilvl="4" w:tplc="FFFFFFFF">
+      <w:numFmt w:val="decimal"/>
+      <w:lvlText w:val=""/>
+      <w:lvlJc w:val="left"/>
+    </w:lvl>
+    <w:lvl w:ilvl="5" w:tplc="FFFFFFFF">
+      <w:numFmt w:val="decimal"/>
+      <w:lvlText w:val=""/>
+      <w:lvlJc w:val="left"/>
+    </w:lvl>
+    <w:lvl w:ilvl="6" w:tplc="FFFFFFFF">
+      <w:numFmt w:val="decimal"/>
+      <w:lvlText w:val=""/>
+      <w:lvlJc w:val="left"/>
+    </w:lvl>
+    <w:lvl w:ilvl="7" w:tplc="FFFFFFFF">
+      <w:numFmt w:val="decimal"/>
+      <w:lvlText w:val=""/>
+      <w:lvlJc w:val="left"/>
+    </w:lvl>
+    <w:lvl w:ilvl="8" w:tplc="FFFFFFFF">
+      <w:numFmt w:val="decimal"/>
+      <w:lvlText w:val=""/>
+      <w:lvlJc w:val="left"/>
+    </w:lvl>
+  </w:abstractNum>
+  <w:abstractNum w:abstractNumId="1" w15:restartNumberingAfterBreak="0">
+    <w:nsid w:val="1ECE720C"/>
+    <w:multiLevelType w:val="hybridMultilevel"/>
+    <w:tmpl w:val="731274CE"/>
+    <w:lvl w:ilvl="0" w:tplc="FFFFFFFF">
+      <w:start w:val="1"/>
+      <w:numFmt w:val="decimal"/>
+      <w:lvlText w:val="%1."/>
+      <w:lvlJc w:val="left"/>
+    </w:lvl>
+    <w:lvl w:ilvl="1" w:tplc="FFFFFFFF">
+      <w:numFmt w:val="decimal"/>
+      <w:lvlText w:val=""/>
+      <w:lvlJc w:val="left"/>
+    </w:lvl>
+    <w:lvl w:ilvl="2" w:tplc="FFFFFFFF">
+      <w:numFmt w:val="decimal"/>
+      <w:lvlText w:val=""/>
+      <w:lvlJc w:val="left"/>
+    </w:lvl>
+    <w:lvl w:ilvl="3" w:tplc="FFFFFFFF">
+      <w:numFmt w:val="decimal"/>
+      <w:lvlText w:val=""/>
+      <w:lvlJc w:val="left"/>
+    </w:lvl>
+    <w:lvl w:ilvl="4" w:tplc="FFFFFFFF">
+      <w:numFmt w:val="decimal"/>
+      <w:lvlText w:val=""/>
+      <w:lvlJc w:val="left"/>
+    </w:lvl>
+    <w:lvl w:ilvl="5" w:tplc="FFFFFFFF">
+      <w:numFmt w:val="decimal"/>
+      <w:lvlText w:val=""/>
+      <w:lvlJc w:val="left"/>
+    </w:lvl>
+    <w:lvl w:ilvl="6" w:tplc="FFFFFFFF">
+      <w:numFmt w:val="decimal"/>
+      <w:lvlText w:val=""/>
+      <w:lvlJc w:val="left"/>
+    </w:lvl>
+    <w:lvl w:ilvl="7" w:tplc="FFFFFFFF">
+      <w:numFmt w:val="decimal"/>
+      <w:lvlText w:val=""/>
+      <w:lvlJc w:val="left"/>
+    </w:lvl>
+    <w:lvl w:ilvl="8" w:tplc="FFFFFFFF">
+      <w:numFmt w:val="decimal"/>
+      <w:lvlText w:val=""/>
+      <w:lvlJc w:val="left"/>
+    </w:lvl>
+  </w:abstractNum>
+  <w:abstractNum w:abstractNumId="2" w15:restartNumberingAfterBreak="0">
+    <w:nsid w:val="489DFD96"/>
+    <w:multiLevelType w:val="hybridMultilevel"/>
+    <w:tmpl w:val="3C3BB463"/>
+    <w:lvl w:ilvl="0" w:tplc="FFFFFFFF">
+      <w:start w:val="1"/>
+      <w:numFmt w:val="decimal"/>
+      <w:lvlText w:val="%1."/>
+      <w:lvlJc w:val="left"/>
+    </w:lvl>
+    <w:lvl w:ilvl="1" w:tplc="FFFFFFFF">
+      <w:numFmt w:val="decimal"/>
+      <w:lvlText w:val=""/>
+      <w:lvlJc w:val="left"/>
+    </w:lvl>
+    <w:lvl w:ilvl="2" w:tplc="FFFFFFFF">
+      <w:numFmt w:val="decimal"/>
+      <w:lvlText w:val=""/>
+      <w:lvlJc w:val="left"/>
+    </w:lvl>
+    <w:lvl w:ilvl="3" w:tplc="FFFFFFFF">
+      <w:numFmt w:val="decimal"/>
+      <w:lvlText w:val=""/>
+      <w:lvlJc w:val="left"/>
+    </w:lvl>
+    <w:lvl w:ilvl="4" w:tplc="FFFFFFFF">
+      <w:numFmt w:val="decimal"/>
+      <w:lvlText w:val=""/>
+      <w:lvlJc w:val="left"/>
+    </w:lvl>
+    <w:lvl w:ilvl="5" w:tplc="FFFFFFFF">
+      <w:numFmt w:val="decimal"/>
+      <w:lvlText w:val=""/>
+      <w:lvlJc w:val="left"/>
+    </w:lvl>
+    <w:lvl w:ilvl="6" w:tplc="FFFFFFFF">
+      <w:numFmt w:val="decimal"/>
+      <w:lvlText w:val=""/>
+      <w:lvlJc w:val="left"/>
+    </w:lvl>
+    <w:lvl w:ilvl="7" w:tplc="FFFFFFFF">
+      <w:numFmt w:val="decimal"/>
+      <w:lvlText w:val=""/>
+      <w:lvlJc w:val="left"/>
+    </w:lvl>
+    <w:lvl w:ilvl="8" w:tplc="FFFFFFFF">
+      <w:numFmt w:val="decimal"/>
+      <w:lvlText w:val=""/>
+      <w:lvlJc w:val="left"/>
+    </w:lvl>
+  </w:abstractNum>
+  <w:num w:numId="1">
+    <w:abstractNumId w:val="1"/>
+  </w:num>
+  <w:num w:numId="2">
+    <w:abstractNumId w:val="0"/>
+  </w:num>
+  <w:num w:numId="3">
+    <w:abstractNumId w:val="2"/>
+  </w:num>
+</w:numbering>
 </file>
 
 <file path=word/styles.xml><?xml version="1.0" encoding="utf-8"?>

</xml_diff>

<commit_message>
Documento actualizado y final
</commit_message>
<xml_diff>
--- a/TALLER.docx
+++ b/TALLER.docx
@@ -9,14 +9,16 @@
           <w:rFonts w:ascii="Times New Roman" w:hAnsi="Times New Roman" w:cs="Times New Roman"/>
           <w:sz w:val="24"/>
           <w:szCs w:val="24"/>
-          <w:lang w:val="es-ES"/>
-        </w:rPr>
-      </w:pPr>
-      <w:r>
-        <w:rPr>
-          <w:rFonts w:ascii="Times New Roman" w:hAnsi="Times New Roman" w:cs="Times New Roman"/>
-          <w:sz w:val="24"/>
-          <w:szCs w:val="24"/>
+          <w:u w:val="single"/>
+          <w:lang w:val="es-ES"/>
+        </w:rPr>
+      </w:pPr>
+      <w:r>
+        <w:rPr>
+          <w:rFonts w:ascii="Times New Roman" w:hAnsi="Times New Roman" w:cs="Times New Roman"/>
+          <w:sz w:val="24"/>
+          <w:szCs w:val="24"/>
+          <w:u w:val="single"/>
           <w:lang w:val="es-ES"/>
         </w:rPr>
         <w:t>Taller 3C_1</w:t>
@@ -29,6 +31,7 @@
           <w:rFonts w:ascii="Times New Roman" w:hAnsi="Times New Roman" w:cs="Times New Roman"/>
           <w:sz w:val="24"/>
           <w:szCs w:val="24"/>
+          <w:u w:val="single"/>
           <w:lang w:val="es-ES"/>
         </w:rPr>
       </w:pPr>
@@ -40,6 +43,7 @@
           <w:rFonts w:ascii="Times New Roman" w:hAnsi="Times New Roman" w:cs="Times New Roman"/>
           <w:sz w:val="24"/>
           <w:szCs w:val="24"/>
+          <w:u w:val="single"/>
           <w:lang w:val="es-ES"/>
         </w:rPr>
       </w:pPr>
@@ -51,14 +55,16 @@
           <w:rFonts w:ascii="Times New Roman" w:hAnsi="Times New Roman" w:cs="Times New Roman"/>
           <w:sz w:val="24"/>
           <w:szCs w:val="24"/>
-          <w:lang w:val="es-ES"/>
-        </w:rPr>
-      </w:pPr>
-      <w:r>
-        <w:rPr>
-          <w:rFonts w:ascii="Times New Roman" w:hAnsi="Times New Roman" w:cs="Times New Roman"/>
-          <w:sz w:val="24"/>
-          <w:szCs w:val="24"/>
+          <w:u w:val="single"/>
+          <w:lang w:val="es-ES"/>
+        </w:rPr>
+      </w:pPr>
+      <w:r>
+        <w:rPr>
+          <w:rFonts w:ascii="Times New Roman" w:hAnsi="Times New Roman" w:cs="Times New Roman"/>
+          <w:sz w:val="24"/>
+          <w:szCs w:val="24"/>
+          <w:u w:val="single"/>
           <w:lang w:val="es-ES"/>
         </w:rPr>
         <w:t>Samuel Alejandro Pineda Leguizamo</w:t>
@@ -71,14 +77,16 @@
           <w:rFonts w:ascii="Times New Roman" w:hAnsi="Times New Roman" w:cs="Times New Roman"/>
           <w:sz w:val="24"/>
           <w:szCs w:val="24"/>
-          <w:lang w:val="es-ES"/>
-        </w:rPr>
-      </w:pPr>
-      <w:r>
-        <w:rPr>
-          <w:rFonts w:ascii="Times New Roman" w:hAnsi="Times New Roman" w:cs="Times New Roman"/>
-          <w:sz w:val="24"/>
-          <w:szCs w:val="24"/>
+          <w:u w:val="single"/>
+          <w:lang w:val="es-ES"/>
+        </w:rPr>
+      </w:pPr>
+      <w:r>
+        <w:rPr>
+          <w:rFonts w:ascii="Times New Roman" w:hAnsi="Times New Roman" w:cs="Times New Roman"/>
+          <w:sz w:val="24"/>
+          <w:szCs w:val="24"/>
+          <w:u w:val="single"/>
           <w:lang w:val="es-ES"/>
         </w:rPr>
         <w:t xml:space="preserve">Kevin Alejandro </w:t>
@@ -89,6 +97,7 @@
           <w:rFonts w:ascii="Times New Roman" w:hAnsi="Times New Roman" w:cs="Times New Roman"/>
           <w:sz w:val="24"/>
           <w:szCs w:val="24"/>
+          <w:u w:val="single"/>
           <w:lang w:val="es-ES"/>
         </w:rPr>
         <w:t>Martinez</w:t>
@@ -99,6 +108,7 @@
           <w:rFonts w:ascii="Times New Roman" w:hAnsi="Times New Roman" w:cs="Times New Roman"/>
           <w:sz w:val="24"/>
           <w:szCs w:val="24"/>
+          <w:u w:val="single"/>
           <w:lang w:val="es-ES"/>
         </w:rPr>
         <w:t xml:space="preserve"> </w:t>
@@ -109,6 +119,7 @@
           <w:rFonts w:ascii="Times New Roman" w:hAnsi="Times New Roman" w:cs="Times New Roman"/>
           <w:sz w:val="24"/>
           <w:szCs w:val="24"/>
+          <w:u w:val="single"/>
           <w:lang w:val="es-ES"/>
         </w:rPr>
         <w:t>Mendez</w:t>
@@ -119,6 +130,7 @@
           <w:rFonts w:ascii="Times New Roman" w:hAnsi="Times New Roman" w:cs="Times New Roman"/>
           <w:sz w:val="24"/>
           <w:szCs w:val="24"/>
+          <w:u w:val="single"/>
           <w:lang w:val="es-ES"/>
         </w:rPr>
         <w:t xml:space="preserve"> </w:t>
@@ -131,14 +143,16 @@
           <w:rFonts w:ascii="Times New Roman" w:hAnsi="Times New Roman" w:cs="Times New Roman"/>
           <w:sz w:val="24"/>
           <w:szCs w:val="24"/>
-          <w:lang w:val="es-ES"/>
-        </w:rPr>
-      </w:pPr>
-      <w:r>
-        <w:rPr>
-          <w:rFonts w:ascii="Times New Roman" w:hAnsi="Times New Roman" w:cs="Times New Roman"/>
-          <w:sz w:val="24"/>
-          <w:szCs w:val="24"/>
+          <w:u w:val="single"/>
+          <w:lang w:val="es-ES"/>
+        </w:rPr>
+      </w:pPr>
+      <w:r>
+        <w:rPr>
+          <w:rFonts w:ascii="Times New Roman" w:hAnsi="Times New Roman" w:cs="Times New Roman"/>
+          <w:sz w:val="24"/>
+          <w:szCs w:val="24"/>
+          <w:u w:val="single"/>
           <w:lang w:val="es-ES"/>
         </w:rPr>
         <w:t xml:space="preserve">Samuel </w:t>
@@ -149,6 +163,7 @@
           <w:rFonts w:ascii="Times New Roman" w:hAnsi="Times New Roman" w:cs="Times New Roman"/>
           <w:sz w:val="24"/>
           <w:szCs w:val="24"/>
+          <w:u w:val="single"/>
           <w:lang w:val="es-ES"/>
         </w:rPr>
         <w:t>Sebastian</w:t>
@@ -159,6 +174,7 @@
           <w:rFonts w:ascii="Times New Roman" w:hAnsi="Times New Roman" w:cs="Times New Roman"/>
           <w:sz w:val="24"/>
           <w:szCs w:val="24"/>
+          <w:u w:val="single"/>
           <w:lang w:val="es-ES"/>
         </w:rPr>
         <w:t xml:space="preserve"> Romero </w:t>
@@ -169,6 +185,7 @@
           <w:rFonts w:ascii="Times New Roman" w:hAnsi="Times New Roman" w:cs="Times New Roman"/>
           <w:sz w:val="24"/>
           <w:szCs w:val="24"/>
+          <w:u w:val="single"/>
           <w:lang w:val="es-ES"/>
         </w:rPr>
         <w:t>Gonzalez</w:t>
@@ -179,6 +196,7 @@
           <w:rFonts w:ascii="Times New Roman" w:hAnsi="Times New Roman" w:cs="Times New Roman"/>
           <w:sz w:val="24"/>
           <w:szCs w:val="24"/>
+          <w:u w:val="single"/>
           <w:lang w:val="es-ES"/>
         </w:rPr>
         <w:t xml:space="preserve"> </w:t>
@@ -191,6 +209,7 @@
           <w:rFonts w:ascii="Times New Roman" w:hAnsi="Times New Roman" w:cs="Times New Roman"/>
           <w:sz w:val="24"/>
           <w:szCs w:val="24"/>
+          <w:u w:val="single"/>
           <w:lang w:val="es-ES"/>
         </w:rPr>
       </w:pPr>
@@ -202,6 +221,7 @@
           <w:rFonts w:ascii="Times New Roman" w:hAnsi="Times New Roman" w:cs="Times New Roman"/>
           <w:sz w:val="24"/>
           <w:szCs w:val="24"/>
+          <w:u w:val="single"/>
           <w:lang w:val="es-ES"/>
         </w:rPr>
       </w:pPr>
@@ -213,6 +233,7 @@
           <w:rFonts w:ascii="Times New Roman" w:hAnsi="Times New Roman" w:cs="Times New Roman"/>
           <w:sz w:val="24"/>
           <w:szCs w:val="24"/>
+          <w:u w:val="single"/>
           <w:lang w:val="es-ES"/>
         </w:rPr>
       </w:pPr>
@@ -224,14 +245,16 @@
           <w:rFonts w:ascii="Times New Roman" w:hAnsi="Times New Roman" w:cs="Times New Roman"/>
           <w:sz w:val="24"/>
           <w:szCs w:val="24"/>
-          <w:lang w:val="es-ES"/>
-        </w:rPr>
-      </w:pPr>
-      <w:r>
-        <w:rPr>
-          <w:rFonts w:ascii="Times New Roman" w:hAnsi="Times New Roman" w:cs="Times New Roman"/>
-          <w:sz w:val="24"/>
-          <w:szCs w:val="24"/>
+          <w:u w:val="single"/>
+          <w:lang w:val="es-ES"/>
+        </w:rPr>
+      </w:pPr>
+      <w:r>
+        <w:rPr>
+          <w:rFonts w:ascii="Times New Roman" w:hAnsi="Times New Roman" w:cs="Times New Roman"/>
+          <w:sz w:val="24"/>
+          <w:szCs w:val="24"/>
+          <w:u w:val="single"/>
           <w:lang w:val="es-ES"/>
         </w:rPr>
         <w:t xml:space="preserve">Universidad </w:t>
@@ -242,6 +265,7 @@
           <w:rFonts w:ascii="Times New Roman" w:hAnsi="Times New Roman" w:cs="Times New Roman"/>
           <w:sz w:val="24"/>
           <w:szCs w:val="24"/>
+          <w:u w:val="single"/>
           <w:lang w:val="es-ES"/>
         </w:rPr>
         <w:t>Catolica</w:t>
@@ -252,6 +276,7 @@
           <w:rFonts w:ascii="Times New Roman" w:hAnsi="Times New Roman" w:cs="Times New Roman"/>
           <w:sz w:val="24"/>
           <w:szCs w:val="24"/>
+          <w:u w:val="single"/>
           <w:lang w:val="es-ES"/>
         </w:rPr>
         <w:t xml:space="preserve"> De Colombia </w:t>
@@ -264,6 +289,7 @@
           <w:rFonts w:ascii="Times New Roman" w:hAnsi="Times New Roman" w:cs="Times New Roman"/>
           <w:sz w:val="24"/>
           <w:szCs w:val="24"/>
+          <w:u w:val="single"/>
           <w:lang w:val="es-ES"/>
         </w:rPr>
       </w:pPr>
@@ -275,6 +301,7 @@
           <w:rFonts w:ascii="Times New Roman" w:hAnsi="Times New Roman" w:cs="Times New Roman"/>
           <w:sz w:val="24"/>
           <w:szCs w:val="24"/>
+          <w:u w:val="single"/>
           <w:lang w:val="es-ES"/>
         </w:rPr>
       </w:pPr>
@@ -286,6 +313,7 @@
           <w:rFonts w:ascii="Times New Roman" w:hAnsi="Times New Roman" w:cs="Times New Roman"/>
           <w:sz w:val="24"/>
           <w:szCs w:val="24"/>
+          <w:u w:val="single"/>
           <w:lang w:val="es-ES"/>
         </w:rPr>
       </w:pPr>
@@ -297,6 +325,7 @@
           <w:rFonts w:ascii="Times New Roman" w:hAnsi="Times New Roman" w:cs="Times New Roman"/>
           <w:sz w:val="24"/>
           <w:szCs w:val="24"/>
+          <w:u w:val="single"/>
           <w:lang w:val="es-ES"/>
         </w:rPr>
       </w:pPr>
@@ -308,14 +337,16 @@
           <w:rFonts w:ascii="Times New Roman" w:hAnsi="Times New Roman" w:cs="Times New Roman"/>
           <w:sz w:val="24"/>
           <w:szCs w:val="24"/>
-          <w:lang w:val="es-ES"/>
-        </w:rPr>
-      </w:pPr>
-      <w:r>
-        <w:rPr>
-          <w:rFonts w:ascii="Times New Roman" w:hAnsi="Times New Roman" w:cs="Times New Roman"/>
-          <w:sz w:val="24"/>
-          <w:szCs w:val="24"/>
+          <w:u w:val="single"/>
+          <w:lang w:val="es-ES"/>
+        </w:rPr>
+      </w:pPr>
+      <w:r>
+        <w:rPr>
+          <w:rFonts w:ascii="Times New Roman" w:hAnsi="Times New Roman" w:cs="Times New Roman"/>
+          <w:sz w:val="24"/>
+          <w:szCs w:val="24"/>
+          <w:u w:val="single"/>
           <w:lang w:val="es-ES"/>
         </w:rPr>
         <w:t xml:space="preserve">Desarrollo De Software </w:t>
@@ -328,6 +359,7 @@
           <w:rFonts w:ascii="Times New Roman" w:hAnsi="Times New Roman" w:cs="Times New Roman"/>
           <w:sz w:val="24"/>
           <w:szCs w:val="24"/>
+          <w:u w:val="single"/>
           <w:lang w:val="es-ES"/>
         </w:rPr>
       </w:pPr>
@@ -339,6 +371,7 @@
           <w:rFonts w:ascii="Times New Roman" w:hAnsi="Times New Roman" w:cs="Times New Roman"/>
           <w:sz w:val="24"/>
           <w:szCs w:val="24"/>
+          <w:u w:val="single"/>
           <w:lang w:val="es-ES"/>
         </w:rPr>
       </w:pPr>
@@ -350,6 +383,7 @@
           <w:rFonts w:ascii="Times New Roman" w:hAnsi="Times New Roman" w:cs="Times New Roman"/>
           <w:sz w:val="24"/>
           <w:szCs w:val="24"/>
+          <w:u w:val="single"/>
           <w:lang w:val="es-ES"/>
         </w:rPr>
       </w:pPr>
@@ -361,6 +395,7 @@
           <w:rFonts w:ascii="Times New Roman" w:hAnsi="Times New Roman" w:cs="Times New Roman"/>
           <w:sz w:val="24"/>
           <w:szCs w:val="24"/>
+          <w:u w:val="single"/>
           <w:lang w:val="es-ES"/>
         </w:rPr>
       </w:pPr>
@@ -372,6 +407,7 @@
           <w:rFonts w:ascii="Times New Roman" w:hAnsi="Times New Roman" w:cs="Times New Roman"/>
           <w:sz w:val="24"/>
           <w:szCs w:val="24"/>
+          <w:u w:val="single"/>
           <w:lang w:val="es-ES"/>
         </w:rPr>
       </w:pPr>
@@ -383,14 +419,16 @@
           <w:rFonts w:ascii="Times New Roman" w:hAnsi="Times New Roman" w:cs="Times New Roman"/>
           <w:sz w:val="24"/>
           <w:szCs w:val="24"/>
-          <w:lang w:val="es-ES"/>
-        </w:rPr>
-      </w:pPr>
-      <w:r>
-        <w:rPr>
-          <w:rFonts w:ascii="Times New Roman" w:hAnsi="Times New Roman" w:cs="Times New Roman"/>
-          <w:sz w:val="24"/>
-          <w:szCs w:val="24"/>
+          <w:u w:val="single"/>
+          <w:lang w:val="es-ES"/>
+        </w:rPr>
+      </w:pPr>
+      <w:r>
+        <w:rPr>
+          <w:rFonts w:ascii="Times New Roman" w:hAnsi="Times New Roman" w:cs="Times New Roman"/>
+          <w:sz w:val="24"/>
+          <w:szCs w:val="24"/>
+          <w:u w:val="single"/>
           <w:lang w:val="es-ES"/>
         </w:rPr>
         <w:t xml:space="preserve">Manuel </w:t>
@@ -401,6 +439,7 @@
           <w:rFonts w:ascii="Times New Roman" w:hAnsi="Times New Roman" w:cs="Times New Roman"/>
           <w:sz w:val="24"/>
           <w:szCs w:val="24"/>
+          <w:u w:val="single"/>
           <w:lang w:val="es-ES"/>
         </w:rPr>
         <w:t>Baez</w:t>
@@ -411,6 +450,7 @@
           <w:rFonts w:ascii="Times New Roman" w:hAnsi="Times New Roman" w:cs="Times New Roman"/>
           <w:sz w:val="24"/>
           <w:szCs w:val="24"/>
+          <w:u w:val="single"/>
           <w:lang w:val="es-ES"/>
         </w:rPr>
         <w:t xml:space="preserve"> </w:t>
@@ -423,6 +463,7 @@
           <w:rFonts w:ascii="Times New Roman" w:hAnsi="Times New Roman" w:cs="Times New Roman"/>
           <w:sz w:val="24"/>
           <w:szCs w:val="24"/>
+          <w:u w:val="single"/>
           <w:lang w:val="es-ES"/>
         </w:rPr>
       </w:pPr>
@@ -434,6 +475,7 @@
           <w:rFonts w:ascii="Times New Roman" w:hAnsi="Times New Roman" w:cs="Times New Roman"/>
           <w:sz w:val="24"/>
           <w:szCs w:val="24"/>
+          <w:u w:val="single"/>
           <w:lang w:val="es-ES"/>
         </w:rPr>
       </w:pPr>
@@ -445,6 +487,7 @@
           <w:rFonts w:ascii="Times New Roman" w:hAnsi="Times New Roman" w:cs="Times New Roman"/>
           <w:sz w:val="24"/>
           <w:szCs w:val="24"/>
+          <w:u w:val="single"/>
           <w:lang w:val="es-ES"/>
         </w:rPr>
       </w:pPr>
@@ -456,6 +499,7 @@
           <w:rFonts w:ascii="Times New Roman" w:hAnsi="Times New Roman" w:cs="Times New Roman"/>
           <w:sz w:val="24"/>
           <w:szCs w:val="24"/>
+          <w:u w:val="single"/>
           <w:lang w:val="es-ES"/>
         </w:rPr>
       </w:pPr>
@@ -467,14 +511,16 @@
           <w:rFonts w:ascii="Times New Roman" w:hAnsi="Times New Roman" w:cs="Times New Roman"/>
           <w:sz w:val="24"/>
           <w:szCs w:val="24"/>
-          <w:lang w:val="es-ES"/>
-        </w:rPr>
-      </w:pPr>
-      <w:r>
-        <w:rPr>
-          <w:rFonts w:ascii="Times New Roman" w:hAnsi="Times New Roman" w:cs="Times New Roman"/>
-          <w:sz w:val="24"/>
-          <w:szCs w:val="24"/>
+          <w:u w:val="single"/>
+          <w:lang w:val="es-ES"/>
+        </w:rPr>
+      </w:pPr>
+      <w:r>
+        <w:rPr>
+          <w:rFonts w:ascii="Times New Roman" w:hAnsi="Times New Roman" w:cs="Times New Roman"/>
+          <w:sz w:val="24"/>
+          <w:szCs w:val="24"/>
+          <w:u w:val="single"/>
           <w:lang w:val="es-ES"/>
         </w:rPr>
         <w:br/>
@@ -488,6 +534,7 @@
           <w:rFonts w:ascii="Times New Roman" w:hAnsi="Times New Roman" w:cs="Times New Roman"/>
           <w:sz w:val="24"/>
           <w:szCs w:val="24"/>
+          <w:u w:val="single"/>
           <w:lang w:val="es-ES"/>
         </w:rPr>
       </w:pPr>
@@ -499,6 +546,7 @@
           <w:rFonts w:ascii="Times New Roman" w:hAnsi="Times New Roman" w:cs="Times New Roman"/>
           <w:sz w:val="24"/>
           <w:szCs w:val="24"/>
+          <w:u w:val="single"/>
           <w:lang w:val="es-ES"/>
         </w:rPr>
       </w:pPr>
@@ -508,6 +556,7 @@
         <w:pStyle w:val="Default"/>
         <w:rPr>
           <w:rFonts w:ascii="Times New Roman" w:hAnsi="Times New Roman" w:cs="Times New Roman"/>
+          <w:u w:val="single"/>
         </w:rPr>
       </w:pPr>
     </w:p>
@@ -516,6 +565,7 @@
         <w:pStyle w:val="Default"/>
         <w:rPr>
           <w:rFonts w:ascii="Times New Roman" w:hAnsi="Times New Roman" w:cs="Times New Roman"/>
+          <w:u w:val="single"/>
         </w:rPr>
       </w:pPr>
     </w:p>
@@ -528,13 +578,15 @@
           <w:bCs/>
           <w:sz w:val="24"/>
           <w:szCs w:val="24"/>
-        </w:rPr>
-      </w:pPr>
-      <w:r>
-        <w:rPr>
-          <w:rFonts w:ascii="Times New Roman" w:hAnsi="Times New Roman" w:cs="Times New Roman"/>
-          <w:sz w:val="24"/>
-          <w:szCs w:val="24"/>
+          <w:u w:val="single"/>
+        </w:rPr>
+      </w:pPr>
+      <w:r>
+        <w:rPr>
+          <w:rFonts w:ascii="Times New Roman" w:hAnsi="Times New Roman" w:cs="Times New Roman"/>
+          <w:sz w:val="24"/>
+          <w:szCs w:val="24"/>
+          <w:u w:val="single"/>
         </w:rPr>
         <w:t xml:space="preserve"> </w:t>
       </w:r>
@@ -545,6 +597,7 @@
           <w:bCs/>
           <w:sz w:val="24"/>
           <w:szCs w:val="24"/>
+          <w:u w:val="single"/>
         </w:rPr>
         <w:t>Taller TDD, Git y GitHub:</w:t>
       </w:r>
@@ -558,6 +611,7 @@
           <w:bCs/>
           <w:sz w:val="24"/>
           <w:szCs w:val="24"/>
+          <w:u w:val="single"/>
         </w:rPr>
       </w:pPr>
     </w:p>
@@ -566,6 +620,7 @@
         <w:pStyle w:val="Default"/>
         <w:rPr>
           <w:rFonts w:ascii="Times New Roman" w:hAnsi="Times New Roman" w:cs="Times New Roman"/>
+          <w:u w:val="single"/>
         </w:rPr>
       </w:pPr>
       <w:r>
@@ -573,12 +628,14 @@
           <w:rFonts w:ascii="Times New Roman" w:hAnsi="Times New Roman" w:cs="Times New Roman"/>
           <w:b/>
           <w:bCs/>
+          <w:u w:val="single"/>
         </w:rPr>
         <w:t>1.</w:t>
       </w:r>
       <w:r>
         <w:rPr>
           <w:rFonts w:ascii="Times New Roman" w:hAnsi="Times New Roman" w:cs="Times New Roman"/>
+          <w:u w:val="single"/>
         </w:rPr>
         <w:t xml:space="preserve">Crear los directorios, uno para las funciones y otro para los </w:t>
       </w:r>
@@ -586,6 +643,7 @@
       <w:r>
         <w:rPr>
           <w:rFonts w:ascii="Times New Roman" w:hAnsi="Times New Roman" w:cs="Times New Roman"/>
+          <w:u w:val="single"/>
         </w:rPr>
         <w:t>tests</w:t>
       </w:r>
@@ -593,6 +651,7 @@
       <w:r>
         <w:rPr>
           <w:rFonts w:ascii="Times New Roman" w:hAnsi="Times New Roman" w:cs="Times New Roman"/>
+          <w:u w:val="single"/>
         </w:rPr>
         <w:t xml:space="preserve">. </w:t>
       </w:r>
@@ -605,12 +664,27 @@
           <w:rFonts w:ascii="Times New Roman" w:hAnsi="Times New Roman" w:cs="Times New Roman"/>
           <w:sz w:val="24"/>
           <w:szCs w:val="24"/>
-        </w:rPr>
-      </w:pPr>
-    </w:p>
-    <w:p/>
-    <w:p>
-      <w:r>
+          <w:u w:val="single"/>
+        </w:rPr>
+      </w:pPr>
+    </w:p>
+    <w:p>
+      <w:pPr>
+        <w:rPr>
+          <w:u w:val="single"/>
+        </w:rPr>
+      </w:pPr>
+    </w:p>
+    <w:p>
+      <w:pPr>
+        <w:rPr>
+          <w:u w:val="single"/>
+        </w:rPr>
+      </w:pPr>
+      <w:r>
+        <w:rPr>
+          <w:u w:val="single"/>
+        </w:rPr>
         <w:drawing>
           <wp:inline distT="0" distB="0" distL="0" distR="0" wp14:anchorId="0349615A" wp14:editId="080EA91C">
             <wp:extent cx="3409950" cy="904875"/>
@@ -655,12 +729,24 @@
         </w:drawing>
       </w:r>
     </w:p>
-    <w:p/>
+    <w:p>
+      <w:pPr>
+        <w:rPr>
+          <w:u w:val="single"/>
+        </w:rPr>
+      </w:pPr>
+    </w:p>
     <w:p>
       <w:pPr>
         <w:pStyle w:val="Default"/>
-      </w:pPr>
-      <w:r>
+        <w:rPr>
+          <w:u w:val="single"/>
+        </w:rPr>
+      </w:pPr>
+      <w:r>
+        <w:rPr>
+          <w:u w:val="single"/>
+        </w:rPr>
         <w:t xml:space="preserve">2 </w:t>
       </w:r>
       <w:proofErr w:type="gramStart"/>
@@ -668,6 +754,7 @@
         <w:rPr>
           <w:sz w:val="23"/>
           <w:szCs w:val="23"/>
+          <w:u w:val="single"/>
         </w:rPr>
         <w:t>En</w:t>
       </w:r>
@@ -676,13 +763,28 @@
         <w:rPr>
           <w:sz w:val="23"/>
           <w:szCs w:val="23"/>
+          <w:u w:val="single"/>
         </w:rPr>
         <w:t xml:space="preserve"> la rama principal debe tener este documento </w:t>
       </w:r>
     </w:p>
-    <w:p/>
-    <w:p>
-      <w:r>
+    <w:p>
+      <w:pPr>
+        <w:rPr>
+          <w:u w:val="single"/>
+        </w:rPr>
+      </w:pPr>
+    </w:p>
+    <w:p>
+      <w:pPr>
+        <w:rPr>
+          <w:u w:val="single"/>
+        </w:rPr>
+      </w:pPr>
+      <w:r>
+        <w:rPr>
+          <w:u w:val="single"/>
+        </w:rPr>
         <w:drawing>
           <wp:inline distT="0" distB="0" distL="0" distR="0" wp14:anchorId="50305006" wp14:editId="6815531C">
             <wp:extent cx="3409950" cy="542925"/>
@@ -728,7 +830,15 @@
       </w:r>
     </w:p>
     <w:p>
-      <w:r>
+      <w:pPr>
+        <w:rPr>
+          <w:u w:val="single"/>
+        </w:rPr>
+      </w:pPr>
+      <w:r>
+        <w:rPr>
+          <w:u w:val="single"/>
+        </w:rPr>
         <w:drawing>
           <wp:inline distT="0" distB="0" distL="0" distR="0" wp14:anchorId="5AE14DAE" wp14:editId="1A5D175A">
             <wp:extent cx="5943600" cy="3093085"/>
@@ -766,18 +876,40 @@
         </w:drawing>
       </w:r>
     </w:p>
-    <w:p/>
-    <w:p/>
-    <w:p/>
+    <w:p>
+      <w:pPr>
+        <w:rPr>
+          <w:u w:val="single"/>
+        </w:rPr>
+      </w:pPr>
+    </w:p>
+    <w:p>
+      <w:pPr>
+        <w:rPr>
+          <w:u w:val="single"/>
+        </w:rPr>
+      </w:pPr>
+    </w:p>
+    <w:p>
+      <w:pPr>
+        <w:rPr>
+          <w:u w:val="single"/>
+        </w:rPr>
+      </w:pPr>
+    </w:p>
     <w:p>
       <w:pPr>
         <w:pStyle w:val="Default"/>
         <w:rPr>
           <w:sz w:val="23"/>
           <w:szCs w:val="23"/>
-        </w:rPr>
-      </w:pPr>
-      <w:r>
+          <w:u w:val="single"/>
+        </w:rPr>
+      </w:pPr>
+      <w:r>
+        <w:rPr>
+          <w:u w:val="single"/>
+        </w:rPr>
         <w:lastRenderedPageBreak/>
         <w:t>3.</w:t>
       </w:r>
@@ -785,6 +917,7 @@
         <w:rPr>
           <w:sz w:val="23"/>
           <w:szCs w:val="23"/>
+          <w:u w:val="single"/>
         </w:rPr>
         <w:t xml:space="preserve">Crear dos ramas una llamada rama1 y la otra rama2 </w:t>
       </w:r>
@@ -797,6 +930,9 @@
         </w:rPr>
       </w:pPr>
       <w:r>
+        <w:rPr>
+          <w:u w:val="single"/>
+        </w:rPr>
         <w:drawing>
           <wp:inline distT="0" distB="0" distL="0" distR="0" wp14:anchorId="7072F960" wp14:editId="05D5C799">
             <wp:extent cx="2934109" cy="1448002"/>
@@ -834,12 +970,29 @@
         </w:drawing>
       </w:r>
     </w:p>
-    <w:p/>
-    <w:p>
-      <w:r>
+    <w:p>
+      <w:pPr>
+        <w:rPr>
+          <w:u w:val="single"/>
+        </w:rPr>
+      </w:pPr>
+    </w:p>
+    <w:p>
+      <w:pPr>
+        <w:rPr>
+          <w:u w:val="single"/>
+        </w:rPr>
+      </w:pPr>
+      <w:r>
+        <w:rPr>
+          <w:u w:val="single"/>
+        </w:rPr>
         <w:t xml:space="preserve"> </w:t>
       </w:r>
       <w:r>
+        <w:rPr>
+          <w:u w:val="single"/>
+        </w:rPr>
         <w:drawing>
           <wp:inline distT="0" distB="0" distL="0" distR="0" wp14:anchorId="313EA6DF" wp14:editId="4B9477A7">
             <wp:extent cx="2962688" cy="809738"/>
@@ -877,25 +1030,52 @@
         </w:drawing>
       </w:r>
     </w:p>
-    <w:p/>
+    <w:p>
+      <w:pPr>
+        <w:rPr>
+          <w:u w:val="single"/>
+        </w:rPr>
+      </w:pPr>
+    </w:p>
     <w:p>
       <w:pPr>
         <w:pStyle w:val="Default"/>
-      </w:pPr>
-      <w:r>
+        <w:rPr>
+          <w:u w:val="single"/>
+        </w:rPr>
+      </w:pPr>
+      <w:r>
+        <w:rPr>
+          <w:u w:val="single"/>
+        </w:rPr>
         <w:t xml:space="preserve">4. </w:t>
       </w:r>
       <w:r>
         <w:rPr>
           <w:sz w:val="23"/>
           <w:szCs w:val="23"/>
+          <w:u w:val="single"/>
         </w:rPr>
         <w:t xml:space="preserve">En la rama1 se debe crear hacer un test con dos validaciones para saber si un número es par. </w:t>
       </w:r>
     </w:p>
-    <w:p/>
-    <w:p>
-      <w:r>
+    <w:p>
+      <w:pPr>
+        <w:rPr>
+          <w:u w:val="single"/>
+        </w:rPr>
+      </w:pPr>
+    </w:p>
+    <w:p>
+      <w:pPr>
+        <w:rPr>
+          <w:u w:val="single"/>
+        </w:rPr>
+      </w:pPr>
+      <w:r>
+        <w:rPr>
+          <w:u w:val="single"/>
+        </w:rPr>
         <w:drawing>
           <wp:inline distT="0" distB="0" distL="0" distR="0" wp14:anchorId="4A1D4888" wp14:editId="60745BE7">
             <wp:extent cx="3543795" cy="590632"/>
@@ -934,7 +1114,15 @@
       </w:r>
     </w:p>
     <w:p>
-      <w:r>
+      <w:pPr>
+        <w:rPr>
+          <w:u w:val="single"/>
+        </w:rPr>
+      </w:pPr>
+      <w:r>
+        <w:rPr>
+          <w:u w:val="single"/>
+        </w:rPr>
         <w:drawing>
           <wp:inline distT="0" distB="0" distL="0" distR="0" wp14:anchorId="2674DE47" wp14:editId="51CF539A">
             <wp:extent cx="2790825" cy="1567006"/>
@@ -972,6 +1160,9 @@
         </w:drawing>
       </w:r>
       <w:r>
+        <w:rPr>
+          <w:u w:val="single"/>
+        </w:rPr>
         <w:drawing>
           <wp:inline distT="0" distB="0" distL="0" distR="0" wp14:anchorId="21016ADA" wp14:editId="663136CF">
             <wp:extent cx="2552700" cy="2038350"/>
@@ -1019,13 +1210,22 @@
     <w:p>
       <w:pPr>
         <w:pStyle w:val="Default"/>
+        <w:rPr>
+          <w:u w:val="single"/>
+        </w:rPr>
       </w:pPr>
     </w:p>
     <w:p>
       <w:pPr>
         <w:pStyle w:val="Default"/>
-      </w:pPr>
-      <w:r>
+        <w:rPr>
+          <w:u w:val="single"/>
+        </w:rPr>
+      </w:pPr>
+      <w:r>
+        <w:rPr>
+          <w:u w:val="single"/>
+        </w:rPr>
         <w:t xml:space="preserve"> </w:t>
       </w:r>
     </w:p>
@@ -1035,12 +1235,14 @@
         <w:rPr>
           <w:sz w:val="23"/>
           <w:szCs w:val="23"/>
+          <w:u w:val="single"/>
         </w:rPr>
       </w:pPr>
       <w:r>
         <w:rPr>
           <w:sz w:val="23"/>
           <w:szCs w:val="23"/>
+          <w:u w:val="single"/>
         </w:rPr>
         <w:t>5.</w:t>
       </w:r>
@@ -1048,12 +1250,21 @@
         <w:rPr>
           <w:sz w:val="23"/>
           <w:szCs w:val="23"/>
+          <w:u w:val="single"/>
         </w:rPr>
         <w:t xml:space="preserve">En la rama2 se debe crear hacer un test con dos validaciones para calcular la factorial de un número. </w:t>
       </w:r>
     </w:p>
     <w:p>
-      <w:r>
+      <w:pPr>
+        <w:rPr>
+          <w:u w:val="single"/>
+        </w:rPr>
+      </w:pPr>
+      <w:r>
+        <w:rPr>
+          <w:u w:val="single"/>
+        </w:rPr>
         <w:lastRenderedPageBreak/>
         <w:drawing>
           <wp:inline distT="0" distB="0" distL="0" distR="0" wp14:anchorId="798E0BE0" wp14:editId="596A8DE1">
@@ -1092,6 +1303,9 @@
         </w:drawing>
       </w:r>
       <w:r>
+        <w:rPr>
+          <w:u w:val="single"/>
+        </w:rPr>
         <w:drawing>
           <wp:inline distT="0" distB="0" distL="0" distR="0" wp14:anchorId="2820C539" wp14:editId="0C3AF447">
             <wp:extent cx="3305636" cy="1867161"/>
@@ -1129,6 +1343,9 @@
         </w:drawing>
       </w:r>
       <w:r>
+        <w:rPr>
+          <w:u w:val="single"/>
+        </w:rPr>
         <w:drawing>
           <wp:inline distT="0" distB="0" distL="0" distR="0" wp14:anchorId="0DE90737" wp14:editId="3FC68393">
             <wp:extent cx="4353533" cy="3458058"/>
@@ -1177,6 +1394,7 @@
           <w:color w:val="000000"/>
           <w:sz w:val="24"/>
           <w:szCs w:val="24"/>
+          <w:u w:val="single"/>
         </w:rPr>
       </w:pPr>
     </w:p>
@@ -1191,6 +1409,7 @@
           <w:color w:val="000000"/>
           <w:sz w:val="24"/>
           <w:szCs w:val="24"/>
+          <w:u w:val="single"/>
         </w:rPr>
       </w:pPr>
       <w:r>
@@ -1199,6 +1418,7 @@
           <w:color w:val="000000"/>
           <w:sz w:val="24"/>
           <w:szCs w:val="24"/>
+          <w:u w:val="single"/>
         </w:rPr>
         <w:t xml:space="preserve"> </w:t>
       </w:r>
@@ -1214,6 +1434,7 @@
           <w:color w:val="000000"/>
           <w:sz w:val="23"/>
           <w:szCs w:val="23"/>
+          <w:u w:val="single"/>
         </w:rPr>
       </w:pPr>
       <w:r>
@@ -1222,6 +1443,7 @@
           <w:color w:val="000000"/>
           <w:sz w:val="23"/>
           <w:szCs w:val="23"/>
+          <w:u w:val="single"/>
         </w:rPr>
         <w:t>6.</w:t>
       </w:r>
@@ -1231,6 +1453,7 @@
           <w:color w:val="000000"/>
           <w:sz w:val="23"/>
           <w:szCs w:val="23"/>
+          <w:u w:val="single"/>
         </w:rPr>
         <w:t xml:space="preserve">Suba al GitHub las ramas </w:t>
       </w:r>
@@ -1241,6 +1464,7 @@
           <w:color w:val="000000"/>
           <w:sz w:val="23"/>
           <w:szCs w:val="23"/>
+          <w:u w:val="single"/>
         </w:rPr>
         <w:t>main</w:t>
       </w:r>
@@ -1251,12 +1475,21 @@
           <w:color w:val="000000"/>
           <w:sz w:val="23"/>
           <w:szCs w:val="23"/>
+          <w:u w:val="single"/>
         </w:rPr>
         <w:t xml:space="preserve">, rama1 y rama 2. </w:t>
       </w:r>
     </w:p>
     <w:p>
-      <w:r>
+      <w:pPr>
+        <w:rPr>
+          <w:u w:val="single"/>
+        </w:rPr>
+      </w:pPr>
+      <w:r>
+        <w:rPr>
+          <w:u w:val="single"/>
+        </w:rPr>
         <w:lastRenderedPageBreak/>
         <w:drawing>
           <wp:inline distT="0" distB="0" distL="0" distR="0" wp14:anchorId="3FFB1290" wp14:editId="1E03F89A">
@@ -1295,6 +1528,9 @@
         </w:drawing>
       </w:r>
       <w:r>
+        <w:rPr>
+          <w:u w:val="single"/>
+        </w:rPr>
         <w:drawing>
           <wp:inline distT="0" distB="0" distL="0" distR="0" wp14:anchorId="051A49F2" wp14:editId="5C9370C6">
             <wp:extent cx="5363323" cy="7097115"/>
@@ -1343,6 +1579,7 @@
           <w:color w:val="000000"/>
           <w:sz w:val="24"/>
           <w:szCs w:val="24"/>
+          <w:u w:val="single"/>
         </w:rPr>
       </w:pPr>
     </w:p>
@@ -1357,6 +1594,7 @@
           <w:color w:val="000000"/>
           <w:sz w:val="24"/>
           <w:szCs w:val="24"/>
+          <w:u w:val="single"/>
         </w:rPr>
       </w:pPr>
       <w:r>
@@ -1365,6 +1603,7 @@
           <w:color w:val="000000"/>
           <w:sz w:val="24"/>
           <w:szCs w:val="24"/>
+          <w:u w:val="single"/>
         </w:rPr>
         <w:t xml:space="preserve"> </w:t>
       </w:r>
@@ -1380,6 +1619,7 @@
           <w:color w:val="000000"/>
           <w:sz w:val="23"/>
           <w:szCs w:val="23"/>
+          <w:u w:val="single"/>
         </w:rPr>
       </w:pPr>
       <w:r>
@@ -1388,6 +1628,7 @@
           <w:color w:val="000000"/>
           <w:sz w:val="23"/>
           <w:szCs w:val="23"/>
+          <w:u w:val="single"/>
         </w:rPr>
         <w:t>7.</w:t>
       </w:r>
@@ -1397,6 +1638,7 @@
           <w:color w:val="000000"/>
           <w:sz w:val="23"/>
           <w:szCs w:val="23"/>
+          <w:u w:val="single"/>
         </w:rPr>
         <w:t xml:space="preserve">Realice un </w:t>
       </w:r>
@@ -1407,6 +1649,7 @@
           <w:color w:val="000000"/>
           <w:sz w:val="23"/>
           <w:szCs w:val="23"/>
+          <w:u w:val="single"/>
         </w:rPr>
         <w:t>Pull</w:t>
       </w:r>
@@ -1417,6 +1660,7 @@
           <w:color w:val="000000"/>
           <w:sz w:val="23"/>
           <w:szCs w:val="23"/>
+          <w:u w:val="single"/>
         </w:rPr>
         <w:t xml:space="preserve"> </w:t>
       </w:r>
@@ -1427,6 +1671,7 @@
           <w:color w:val="000000"/>
           <w:sz w:val="23"/>
           <w:szCs w:val="23"/>
+          <w:u w:val="single"/>
         </w:rPr>
         <w:t>request</w:t>
       </w:r>
@@ -1437,6 +1682,7 @@
           <w:color w:val="000000"/>
           <w:sz w:val="23"/>
           <w:szCs w:val="23"/>
+          <w:u w:val="single"/>
         </w:rPr>
         <w:t xml:space="preserve"> (</w:t>
       </w:r>
@@ -1447,6 +1693,7 @@
           <w:color w:val="000000"/>
           <w:sz w:val="23"/>
           <w:szCs w:val="23"/>
+          <w:u w:val="single"/>
         </w:rPr>
         <w:t>merge</w:t>
       </w:r>
@@ -1457,12 +1704,21 @@
           <w:color w:val="000000"/>
           <w:sz w:val="23"/>
           <w:szCs w:val="23"/>
+          <w:u w:val="single"/>
         </w:rPr>
         <w:t xml:space="preserve">) en el repositorio remoto. </w:t>
       </w:r>
     </w:p>
     <w:p>
-      <w:r>
+      <w:pPr>
+        <w:rPr>
+          <w:u w:val="single"/>
+        </w:rPr>
+      </w:pPr>
+      <w:r>
+        <w:rPr>
+          <w:u w:val="single"/>
+        </w:rPr>
         <w:drawing>
           <wp:inline distT="0" distB="0" distL="0" distR="0" wp14:anchorId="66E0CC3B" wp14:editId="6358A866">
             <wp:extent cx="5943600" cy="821055"/>
@@ -1500,6 +1756,9 @@
         </w:drawing>
       </w:r>
       <w:r>
+        <w:rPr>
+          <w:u w:val="single"/>
+        </w:rPr>
         <w:drawing>
           <wp:inline distT="0" distB="0" distL="0" distR="0" wp14:anchorId="6BB0FDC8" wp14:editId="12A7C286">
             <wp:extent cx="5943600" cy="5220335"/>
@@ -1537,6 +1796,9 @@
         </w:drawing>
       </w:r>
       <w:r>
+        <w:rPr>
+          <w:u w:val="single"/>
+        </w:rPr>
         <w:lastRenderedPageBreak/>
         <w:drawing>
           <wp:inline distT="0" distB="0" distL="0" distR="0" wp14:anchorId="7256ECF7" wp14:editId="32009BE1">
@@ -1575,6 +1837,9 @@
         </w:drawing>
       </w:r>
       <w:r>
+        <w:rPr>
+          <w:u w:val="single"/>
+        </w:rPr>
         <w:drawing>
           <wp:inline distT="0" distB="0" distL="0" distR="0" wp14:anchorId="07A275DE" wp14:editId="04E420D3">
             <wp:extent cx="5943600" cy="5186680"/>
@@ -1612,6 +1877,9 @@
         </w:drawing>
       </w:r>
       <w:r>
+        <w:rPr>
+          <w:u w:val="single"/>
+        </w:rPr>
         <w:lastRenderedPageBreak/>
         <w:drawing>
           <wp:inline distT="0" distB="0" distL="0" distR="0" wp14:anchorId="524B0CAC" wp14:editId="4AE625BD">
@@ -1650,6 +1918,9 @@
         </w:drawing>
       </w:r>
       <w:r>
+        <w:rPr>
+          <w:u w:val="single"/>
+        </w:rPr>
         <w:drawing>
           <wp:inline distT="0" distB="0" distL="0" distR="0" wp14:anchorId="50EB0AD6" wp14:editId="32CBFA2F">
             <wp:extent cx="5943600" cy="4789805"/>
@@ -1687,6 +1958,9 @@
         </w:drawing>
       </w:r>
       <w:r>
+        <w:rPr>
+          <w:u w:val="single"/>
+        </w:rPr>
         <w:lastRenderedPageBreak/>
         <w:drawing>
           <wp:inline distT="0" distB="0" distL="0" distR="0" wp14:anchorId="2E1C9E43" wp14:editId="7FF67113">
@@ -1725,6 +1999,9 @@
         </w:drawing>
       </w:r>
       <w:r>
+        <w:rPr>
+          <w:u w:val="single"/>
+        </w:rPr>
         <w:drawing>
           <wp:inline distT="0" distB="0" distL="0" distR="0" wp14:anchorId="14BC7D34" wp14:editId="37B10717">
             <wp:extent cx="5943600" cy="4684395"/>

</xml_diff>